<commit_message>
Editorial redesign and updated CV
- Restyle the site as a riso-printed magazine: Bodoni Moda + Instrument
  Sans, indigo and pink on cool paper, a cover-style hero with a duotone
  portrait and cover lines, projects as features, a pink poetry spread
- Drop the scroll-reveal script and the extra contact stylesheet
- Update the CV to match LinkedIn: EHM role, corrected titles and dates,
  AI SQL Agent and Musami Web QA projects, IBM certifications, portfolio
  link; still one page

Co-Authored-By: Claude Opus 5.5 <noreply@anthropic.com>
Claude-Session: https://claude.ai/code/session_01WwS5ugcj8sYMnXAha68zGA
</commit_message>
<xml_diff>
--- a/assets/Muhammad-Musa-Sarfraz-CV.docx
+++ b/assets/Muhammad-Musa-Sarfraz-CV.docx
@@ -32,12 +32,12 @@
           <w:sz w:val="23"/>
           <w:szCs w:val="23"/>
         </w:rPr>
-        <w:t xml:space="preserve">Python Backend Developer  |  AI Application Development</w:t>
-      </w:r>
-    </w:p>
-    <w:p>
-      <w:pPr>
-        <w:spacing w:after="60"/>
+        <w:t xml:space="preserve">Python Developer  |  AI Applications, Web Scraping &amp; Test Automation</w:t>
+      </w:r>
+    </w:p>
+    <w:p>
+      <w:pPr>
+        <w:spacing w:after="40"/>
         <w:jc w:val="center"/>
       </w:pPr>
       <w:r>
@@ -100,6 +100,26 @@
           <w:t xml:space="preserve">GitHub</w:t>
         </w:r>
       </w:hyperlink>
+      <w:r>
+        <w:rPr>
+          <w:rFonts w:ascii="Calibri" w:cs="Calibri" w:eastAsia="Calibri" w:hAnsi="Calibri"/>
+          <w:sz w:val="20"/>
+          <w:szCs w:val="20"/>
+        </w:rPr>
+        <w:t xml:space="preserve">  |  </w:t>
+      </w:r>
+      <w:hyperlink w:history="1" r:id="rIdPortfolio">
+        <w:r>
+          <w:rPr>
+            <w:rFonts w:ascii="Calibri" w:cs="Calibri" w:eastAsia="Calibri" w:hAnsi="Calibri"/>
+            <w:color w:val="000000"/>
+            <w:sz w:val="20"/>
+            <w:szCs w:val="20"/>
+            <w:u w:val="single"/>
+          </w:rPr>
+          <w:t xml:space="preserve">Portfolio</w:t>
+        </w:r>
+      </w:hyperlink>
     </w:p>
     <w:p>
       <w:pPr>
@@ -107,7 +127,7 @@
         <w:pBdr>
           <w:bottom w:val="single" w:color="000000" w:sz="6" w:space="2"/>
         </w:pBdr>
-        <w:spacing w:after="80" w:before="200"/>
+        <w:spacing w:after="70" w:before="150"/>
       </w:pPr>
       <w:r>
         <w:rPr>
@@ -124,7 +144,7 @@
     </w:p>
     <w:p>
       <w:pPr>
-        <w:spacing w:after="40"/>
+        <w:spacing w:after="30"/>
         <w:jc w:val="both"/>
       </w:pPr>
       <w:r>
@@ -133,7 +153,7 @@
           <w:sz w:val="20"/>
           <w:szCs w:val="20"/>
         </w:rPr>
-        <w:t xml:space="preserve">Computer Science undergraduate building Python backend applications, REST APIs, AI integrations, and automation workflows. Hands-on experience with FastAPI, PostgreSQL, authentication, RAG pipelines, multimodal AI, and API integration. Projects include transcript-grounded question answering, food-image analysis, GitHub activity analytics, and business inventory software.</w:t>
+        <w:t xml:space="preserve">Python developer and Computer Science student at UAF, currently working in web scraping and lead generation with Playwright and Pandas. Builds AI applications with RAG, LangChain, IBM watsonx and FastAPI, including transcript-grounded video Q&amp;A, a natural-language SQL agent and multimodal image analysis, and writes browser and API test automation with Playwright and pytest.</w:t>
       </w:r>
     </w:p>
     <w:p>
@@ -142,7 +162,7 @@
         <w:pBdr>
           <w:bottom w:val="single" w:color="000000" w:sz="6" w:space="2"/>
         </w:pBdr>
-        <w:spacing w:after="80" w:before="200"/>
+        <w:spacing w:after="70" w:before="150"/>
       </w:pPr>
       <w:r>
         <w:rPr>
@@ -159,7 +179,7 @@
     </w:p>
     <w:p>
       <w:pPr>
-        <w:spacing w:after="40"/>
+        <w:spacing w:after="30"/>
       </w:pPr>
       <w:r>
         <w:rPr>
@@ -177,35 +197,58 @@
           <w:sz w:val="20"/>
           <w:szCs w:val="20"/>
         </w:rPr>
-        <w:t xml:space="preserve">Python, FastAPI, REST APIs, SQL, PostgreSQL, SQLite, SQLAlchemy</w:t>
-      </w:r>
-    </w:p>
-    <w:p>
-      <w:pPr>
-        <w:spacing w:after="40"/>
-      </w:pPr>
-      <w:r>
-        <w:rPr>
-          <w:rFonts w:ascii="Calibri" w:cs="Calibri" w:eastAsia="Calibri" w:hAnsi="Calibri"/>
-          <w:b/>
-          <w:bCs/>
-          <w:sz w:val="20"/>
-          <w:szCs w:val="20"/>
-        </w:rPr>
-        <w:t xml:space="preserve">AI and automation: </w:t>
-      </w:r>
-      <w:r>
-        <w:rPr>
-          <w:rFonts w:ascii="Calibri" w:cs="Calibri" w:eastAsia="Calibri" w:hAnsi="Calibri"/>
-          <w:sz w:val="20"/>
-          <w:szCs w:val="20"/>
-        </w:rPr>
-        <w:t xml:space="preserve">RAG, LangChain, FAISS, IBM watsonx, LLM APIs, scikit-learn, OpenCV, Pandas, NumPy, n8n</w:t>
-      </w:r>
-    </w:p>
-    <w:p>
-      <w:pPr>
-        <w:spacing w:after="40"/>
+        <w:t xml:space="preserve">Python, FastAPI, REST APIs, SQL, PostgreSQL, MySQL, SQLite, SQLAlchemy</w:t>
+      </w:r>
+    </w:p>
+    <w:p>
+      <w:pPr>
+        <w:spacing w:after="30"/>
+      </w:pPr>
+      <w:r>
+        <w:rPr>
+          <w:rFonts w:ascii="Calibri" w:cs="Calibri" w:eastAsia="Calibri" w:hAnsi="Calibri"/>
+          <w:b/>
+          <w:bCs/>
+          <w:sz w:val="20"/>
+          <w:szCs w:val="20"/>
+        </w:rPr>
+        <w:t xml:space="preserve">AI and LLMs: </w:t>
+      </w:r>
+      <w:r>
+        <w:rPr>
+          <w:rFonts w:ascii="Calibri" w:cs="Calibri" w:eastAsia="Calibri" w:hAnsi="Calibri"/>
+          <w:sz w:val="20"/>
+          <w:szCs w:val="20"/>
+        </w:rPr>
+        <w:t xml:space="preserve">RAG, LangChain, IBM watsonx, IBM Granite, FAISS, vector databases, LLM APIs, scikit-learn, OpenCV</w:t>
+      </w:r>
+    </w:p>
+    <w:p>
+      <w:pPr>
+        <w:spacing w:after="30"/>
+      </w:pPr>
+      <w:r>
+        <w:rPr>
+          <w:rFonts w:ascii="Calibri" w:cs="Calibri" w:eastAsia="Calibri" w:hAnsi="Calibri"/>
+          <w:b/>
+          <w:bCs/>
+          <w:sz w:val="20"/>
+          <w:szCs w:val="20"/>
+        </w:rPr>
+        <w:t xml:space="preserve">Scraping, data and testing: </w:t>
+      </w:r>
+      <w:r>
+        <w:rPr>
+          <w:rFonts w:ascii="Calibri" w:cs="Calibri" w:eastAsia="Calibri" w:hAnsi="Calibri"/>
+          <w:sz w:val="20"/>
+          <w:szCs w:val="20"/>
+        </w:rPr>
+        <w:t xml:space="preserve">Web scraping, Playwright, Pandas, NumPy, data cleaning, pytest, GitHub Actions, n8n</w:t>
+      </w:r>
+    </w:p>
+    <w:p>
+      <w:pPr>
+        <w:spacing w:after="30"/>
       </w:pPr>
       <w:r>
         <w:rPr>
@@ -223,7 +266,7 @@
           <w:sz w:val="20"/>
           <w:szCs w:val="20"/>
         </w:rPr>
-        <w:t xml:space="preserve">Docker, Git, GitHub, Jira, Flask, basic HTML, software testing, technical documentation</w:t>
+        <w:t xml:space="preserve">Docker, Git, GitHub, Jira, Agile, Flask, basic HTML, technical documentation</w:t>
       </w:r>
     </w:p>
     <w:p>
@@ -232,7 +275,7 @@
         <w:pBdr>
           <w:bottom w:val="single" w:color="000000" w:sz="6" w:space="2"/>
         </w:pBdr>
-        <w:spacing w:after="80" w:before="200"/>
+        <w:spacing w:after="70" w:before="150"/>
       </w:pPr>
       <w:r>
         <w:rPr>
@@ -250,7 +293,7 @@
     <w:p>
       <w:pPr>
         <w:keepNext/>
-        <w:spacing w:after="30" w:before="100"/>
+        <w:spacing w:after="20" w:before="70"/>
       </w:pPr>
       <w:hyperlink w:history="1" r:id="rIdndi3hgptf-avf6ekybilq">
         <w:r>
@@ -283,21 +326,115 @@
           <w:ilvl w:val="0"/>
           <w:numId w:val="2"/>
         </w:numPr>
-        <w:spacing w:after="40"/>
-      </w:pPr>
-      <w:r>
-        <w:rPr>
-          <w:rFonts w:ascii="Calibri" w:cs="Calibri" w:eastAsia="Calibri" w:hAnsi="Calibri"/>
-          <w:sz w:val="20"/>
-          <w:szCs w:val="20"/>
-        </w:rPr>
-        <w:t xml:space="preserve">Built a RAG pipeline that extracts YouTube transcripts, creates vector embeddings, retrieves relevant passages, summarizes videos, and answers grounded follow-up questions.</w:t>
-      </w:r>
-    </w:p>
-    <w:p>
-      <w:pPr>
-        <w:keepNext/>
-        <w:spacing w:after="30" w:before="100"/>
+        <w:spacing w:after="30"/>
+      </w:pPr>
+      <w:r>
+        <w:rPr>
+          <w:rFonts w:ascii="Calibri" w:cs="Calibri" w:eastAsia="Calibri" w:hAnsi="Calibri"/>
+          <w:sz w:val="20"/>
+          <w:szCs w:val="20"/>
+        </w:rPr>
+        <w:t xml:space="preserve">RAG pipeline that summarizes YouTube videos and answers follow-up questions grounded in the transcript.</w:t>
+      </w:r>
+    </w:p>
+    <w:p>
+      <w:pPr>
+        <w:keepNext/>
+        <w:spacing w:after="20" w:before="70"/>
+      </w:pPr>
+      <w:hyperlink w:history="1" r:id="rIdSqlAgent">
+        <w:r>
+          <w:rPr>
+            <w:rFonts w:ascii="Calibri" w:cs="Calibri" w:eastAsia="Calibri" w:hAnsi="Calibri"/>
+            <w:b/>
+            <w:bCs/>
+            <w:color w:val="000000"/>
+            <w:sz w:val="20"/>
+            <w:szCs w:val="20"/>
+            <w:u w:val="single"/>
+          </w:rPr>
+          <w:t xml:space="preserve">AI SQL Agent</w:t>
+        </w:r>
+      </w:hyperlink>
+      <w:r>
+        <w:rPr>
+          <w:rFonts w:ascii="Calibri" w:cs="Calibri" w:eastAsia="Calibri" w:hAnsi="Calibri"/>
+          <w:color w:val="404040"/>
+          <w:sz w:val="20"/>
+          <w:szCs w:val="20"/>
+        </w:rPr>
+        <w:t xml:space="preserve">  |  Python, LangChain, IBM watsonx, IBM Granite, MySQL</w:t>
+      </w:r>
+    </w:p>
+    <w:p>
+      <w:pPr>
+        <w:pStyle w:val="ListParagraph"/>
+        <w:numPr>
+          <w:ilvl w:val="0"/>
+          <w:numId w:val="2"/>
+        </w:numPr>
+        <w:spacing w:after="30"/>
+      </w:pPr>
+      <w:r>
+        <w:rPr>
+          <w:rFonts w:ascii="Calibri" w:cs="Calibri" w:eastAsia="Calibri" w:hAnsi="Calibri"/>
+          <w:sz w:val="20"/>
+          <w:szCs w:val="20"/>
+        </w:rPr>
+        <w:t xml:space="preserve">Agent that turns natural-language questions into SQL, runs them on MySQL and returns readable answers.</w:t>
+      </w:r>
+    </w:p>
+    <w:p>
+      <w:pPr>
+        <w:keepNext/>
+        <w:spacing w:after="20" w:before="70"/>
+      </w:pPr>
+      <w:hyperlink w:history="1" r:id="rIdWebQa">
+        <w:r>
+          <w:rPr>
+            <w:rFonts w:ascii="Calibri" w:cs="Calibri" w:eastAsia="Calibri" w:hAnsi="Calibri"/>
+            <w:b/>
+            <w:bCs/>
+            <w:color w:val="000000"/>
+            <w:sz w:val="20"/>
+            <w:szCs w:val="20"/>
+            <w:u w:val="single"/>
+          </w:rPr>
+          <w:t xml:space="preserve">Musami Web QA</w:t>
+        </w:r>
+      </w:hyperlink>
+      <w:r>
+        <w:rPr>
+          <w:rFonts w:ascii="Calibri" w:cs="Calibri" w:eastAsia="Calibri" w:hAnsi="Calibri"/>
+          <w:color w:val="404040"/>
+          <w:sz w:val="20"/>
+          <w:szCs w:val="20"/>
+        </w:rPr>
+        <w:t xml:space="preserve">  |  Python, Playwright, pytest, GitHub Actions</w:t>
+      </w:r>
+    </w:p>
+    <w:p>
+      <w:pPr>
+        <w:pStyle w:val="ListParagraph"/>
+        <w:numPr>
+          <w:ilvl w:val="0"/>
+          <w:numId w:val="2"/>
+        </w:numPr>
+        <w:spacing w:after="30"/>
+      </w:pPr>
+      <w:r>
+        <w:rPr>
+          <w:rFonts w:ascii="Calibri" w:cs="Calibri" w:eastAsia="Calibri" w:hAnsi="Calibri"/>
+          <w:sz w:val="20"/>
+          <w:szCs w:val="20"/>
+        </w:rPr>
+        <w:t xml:space="preserve">36 automated UI and API checks for a demo shop, with page objects, failure traces and GitHub Actions CI.</w:t>
+      </w:r>
+    </w:p>
+    <w:p>
+      <w:pPr>
+        <w:keepNext/>
+        <w:spacing w:after="20" w:before="70"/>
       </w:pPr>
       <w:hyperlink w:history="1" r:id="rIdxlktcntpf-qg163kfc0av">
         <w:r>
@@ -330,23 +467,23 @@
           <w:ilvl w:val="0"/>
           <w:numId w:val="2"/>
         </w:numPr>
-        <w:spacing w:after="40"/>
-      </w:pPr>
-      <w:r>
-        <w:rPr>
-          <w:rFonts w:ascii="Calibri" w:cs="Calibri" w:eastAsia="Calibri" w:hAnsi="Calibri"/>
-          <w:sz w:val="20"/>
-          <w:szCs w:val="20"/>
-        </w:rPr>
-        <w:t xml:space="preserve">Built a multimodal application that analyzes uploaded food images and returns identified items, portion and calorie estimates, nutrient breakdowns, and an AI-generated health evaluation.</w:t>
-      </w:r>
-    </w:p>
-    <w:p>
-      <w:pPr>
-        <w:keepNext/>
-        <w:spacing w:after="30" w:before="100"/>
-      </w:pPr>
-      <w:hyperlink w:history="1" r:id="rId1kcxhhbab-k3cynhh5hle">
+        <w:spacing w:after="30"/>
+      </w:pPr>
+      <w:r>
+        <w:rPr>
+          <w:rFonts w:ascii="Calibri" w:cs="Calibri" w:eastAsia="Calibri" w:hAnsi="Calibri"/>
+          <w:sz w:val="20"/>
+          <w:szCs w:val="20"/>
+        </w:rPr>
+        <w:t xml:space="preserve">Multimodal app that identifies food items and estimates portions, calories and nutrients from a photo.</w:t>
+      </w:r>
+    </w:p>
+    <w:p>
+      <w:pPr>
+        <w:keepNext/>
+        <w:spacing w:after="20" w:before="70"/>
+      </w:pPr>
+      <w:hyperlink w:history="1" r:id="rIdlwtg9zcc9n0zykkjpaixs">
         <w:r>
           <w:rPr>
             <w:rFonts w:ascii="Calibri" w:cs="Calibri" w:eastAsia="Calibri" w:hAnsi="Calibri"/>
@@ -357,7 +494,7 @@
             <w:szCs w:val="20"/>
             <w:u w:val="single"/>
           </w:rPr>
-          <w:t xml:space="preserve">GitPulse</w:t>
+          <w:t xml:space="preserve">Fashion Style Finder</w:t>
         </w:r>
       </w:hyperlink>
       <w:r>
@@ -367,7 +504,7 @@
           <w:sz w:val="20"/>
           <w:szCs w:val="20"/>
         </w:rPr>
-        <w:t xml:space="preserve">  |  GitHub data, activity analytics, dashboard design</w:t>
+        <w:t xml:space="preserve">  |  ResNet50, similarity search, IBM watsonx, Gradio</w:t>
       </w:r>
     </w:p>
     <w:p>
@@ -377,21 +514,21 @@
           <w:ilvl w:val="0"/>
           <w:numId w:val="2"/>
         </w:numPr>
-        <w:spacing w:after="40"/>
-      </w:pPr>
-      <w:r>
-        <w:rPr>
-          <w:rFonts w:ascii="Calibri" w:cs="Calibri" w:eastAsia="Calibri" w:hAnsi="Calibri"/>
-          <w:sz w:val="20"/>
-          <w:szCs w:val="20"/>
-        </w:rPr>
-        <w:t xml:space="preserve">Built an interactive dashboard that turns public GitHub activity into understandable engineering metrics and health signals.</w:t>
-      </w:r>
-    </w:p>
-    <w:p>
-      <w:pPr>
-        <w:keepNext/>
-        <w:spacing w:after="30" w:before="100"/>
+        <w:spacing w:after="30"/>
+      </w:pPr>
+      <w:r>
+        <w:rPr>
+          <w:rFonts w:ascii="Calibri" w:cs="Calibri" w:eastAsia="Calibri" w:hAnsi="Calibri"/>
+          <w:sz w:val="20"/>
+          <w:szCs w:val="20"/>
+        </w:rPr>
+        <w:t xml:space="preserve">Finds visually similar fashion items with image embeddings and generates a structured style analysis.</w:t>
+      </w:r>
+    </w:p>
+    <w:p>
+      <w:pPr>
+        <w:keepNext/>
+        <w:spacing w:after="20" w:before="70"/>
       </w:pPr>
       <w:hyperlink w:history="1" r:id="rIdlks6gpbhtlfxgz9pmxyja">
         <w:r>
@@ -424,44 +561,40 @@
           <w:ilvl w:val="0"/>
           <w:numId w:val="2"/>
         </w:numPr>
-        <w:spacing w:after="40"/>
-      </w:pPr>
-      <w:r>
-        <w:rPr>
-          <w:rFonts w:ascii="Calibri" w:cs="Calibri" w:eastAsia="Calibri" w:hAnsi="Calibri"/>
-          <w:sz w:val="20"/>
-          <w:szCs w:val="20"/>
-        </w:rPr>
-        <w:t xml:space="preserve">Developed a business application for inventory, customers, sales, returns, CSV exports, and reports, including automatic stock restoration for returned goods.</w:t>
-      </w:r>
-    </w:p>
-    <w:p>
-      <w:pPr>
-        <w:keepNext/>
-        <w:spacing w:after="30" w:before="100"/>
-      </w:pPr>
-      <w:hyperlink w:history="1" r:id="rIdlwtg9zcc9n0zykkjpaixs">
-        <w:r>
-          <w:rPr>
-            <w:rFonts w:ascii="Calibri" w:cs="Calibri" w:eastAsia="Calibri" w:hAnsi="Calibri"/>
-            <w:b/>
-            <w:bCs/>
-            <w:color w:val="000000"/>
-            <w:sz w:val="20"/>
-            <w:szCs w:val="20"/>
-            <w:u w:val="single"/>
-          </w:rPr>
-          <w:t xml:space="preserve">Fashion Style Finder</w:t>
-        </w:r>
-      </w:hyperlink>
-      <w:r>
-        <w:rPr>
-          <w:rFonts w:ascii="Calibri" w:cs="Calibri" w:eastAsia="Calibri" w:hAnsi="Calibri"/>
-          <w:color w:val="404040"/>
-          <w:sz w:val="20"/>
-          <w:szCs w:val="20"/>
-        </w:rPr>
-        <w:t xml:space="preserve">  |  ResNet50, similarity search, IBM watsonx, Gradio</w:t>
+        <w:spacing w:after="30"/>
+      </w:pPr>
+      <w:r>
+        <w:rPr>
+          <w:rFonts w:ascii="Calibri" w:cs="Calibri" w:eastAsia="Calibri" w:hAnsi="Calibri"/>
+          <w:sz w:val="20"/>
+          <w:szCs w:val="20"/>
+        </w:rPr>
+        <w:t xml:space="preserve">Desktop app for inventory, customers, sales, returns and reports, with automatic stock restoration.</w:t>
+      </w:r>
+    </w:p>
+    <w:p>
+      <w:pPr>
+        <w:keepNext/>
+        <w:spacing w:after="20" w:before="70"/>
+      </w:pPr>
+      <w:r>
+        <w:rPr>
+          <w:rFonts w:ascii="Calibri" w:cs="Calibri" w:eastAsia="Calibri" w:hAnsi="Calibri"/>
+          <w:b/>
+          <w:bCs/>
+          <w:sz w:val="20"/>
+          <w:szCs w:val="20"/>
+        </w:rPr>
+        <w:t xml:space="preserve">GitPulse (in progress, private)</w:t>
+      </w:r>
+      <w:r>
+        <w:rPr>
+          <w:rFonts w:ascii="Calibri" w:cs="Calibri" w:eastAsia="Calibri" w:hAnsi="Calibri"/>
+          <w:color w:val="404040"/>
+          <w:sz w:val="20"/>
+          <w:szCs w:val="20"/>
+        </w:rPr>
+        <w:t xml:space="preserve">  |  GitHub data, activity analytics, dashboard design</w:t>
       </w:r>
     </w:p>
     <w:p>
@@ -471,15 +604,15 @@
           <w:ilvl w:val="0"/>
           <w:numId w:val="2"/>
         </w:numPr>
-        <w:spacing w:after="40"/>
-      </w:pPr>
-      <w:r>
-        <w:rPr>
-          <w:rFonts w:ascii="Calibri" w:cs="Calibri" w:eastAsia="Calibri" w:hAnsi="Calibri"/>
-          <w:sz w:val="20"/>
-          <w:szCs w:val="20"/>
-        </w:rPr>
-        <w:t xml:space="preserve">Combined image embeddings and cosine similarity with a vision-language model to retrieve related fashion items and generate a structured style analysis.</w:t>
+        <w:spacing w:after="30"/>
+      </w:pPr>
+      <w:r>
+        <w:rPr>
+          <w:rFonts w:ascii="Calibri" w:cs="Calibri" w:eastAsia="Calibri" w:hAnsi="Calibri"/>
+          <w:sz w:val="20"/>
+          <w:szCs w:val="20"/>
+        </w:rPr>
+        <w:t xml:space="preserve">Building an interactive dashboard that turns GitHub activity into understandable engineering metrics and health signals.</w:t>
       </w:r>
     </w:p>
     <w:p>
@@ -488,7 +621,7 @@
         <w:pBdr>
           <w:bottom w:val="single" w:color="000000" w:sz="6" w:space="2"/>
         </w:pBdr>
-        <w:spacing w:after="80" w:before="200"/>
+        <w:spacing w:after="70" w:before="150"/>
       </w:pPr>
       <w:r>
         <w:rPr>
@@ -509,26 +642,26 @@
         <w:tabs>
           <w:tab w:val="right" w:pos="10206"/>
         </w:tabs>
-        <w:spacing w:after="30" w:before="100"/>
-      </w:pPr>
-      <w:r>
-        <w:rPr>
-          <w:rFonts w:ascii="Calibri" w:cs="Calibri" w:eastAsia="Calibri" w:hAnsi="Calibri"/>
-          <w:b/>
-          <w:bCs/>
-          <w:sz w:val="20"/>
-          <w:szCs w:val="20"/>
-        </w:rPr>
-        <w:t xml:space="preserve">Project Management Intern</w:t>
-      </w:r>
-      <w:r>
-        <w:rPr>
-          <w:rFonts w:ascii="Calibri" w:cs="Calibri" w:eastAsia="Calibri" w:hAnsi="Calibri"/>
-          <w:color w:val="404040"/>
-          <w:sz w:val="20"/>
-          <w:szCs w:val="20"/>
-        </w:rPr>
-        <w:t xml:space="preserve">  |  Pak Logics</w:t>
+        <w:spacing w:after="20" w:before="40"/>
+      </w:pPr>
+      <w:r>
+        <w:rPr>
+          <w:rFonts w:ascii="Calibri" w:cs="Calibri" w:eastAsia="Calibri" w:hAnsi="Calibri"/>
+          <w:b/>
+          <w:bCs/>
+          <w:sz w:val="20"/>
+          <w:szCs w:val="20"/>
+        </w:rPr>
+        <w:t xml:space="preserve">Web Scraping and Lead Generation Specialist (Python)</w:t>
+      </w:r>
+      <w:r>
+        <w:rPr>
+          <w:rFonts w:ascii="Calibri" w:cs="Calibri" w:eastAsia="Calibri" w:hAnsi="Calibri"/>
+          <w:color w:val="404040"/>
+          <w:sz w:val="20"/>
+          <w:szCs w:val="20"/>
+        </w:rPr>
+        <w:t xml:space="preserve">  |  EHM Technology Services</w:t>
       </w:r>
       <w:r>
         <w:rPr>
@@ -539,7 +672,7 @@
           <w:sz w:val="20"/>
           <w:szCs w:val="20"/>
         </w:rPr>
-        <w:t xml:space="preserve">	Jan 2026 to Apr 2026</w:t>
+        <w:t xml:space="preserve">	Oct 2026 to Present</w:t>
       </w:r>
     </w:p>
     <w:p>
@@ -549,15 +682,15 @@
           <w:ilvl w:val="0"/>
           <w:numId w:val="2"/>
         </w:numPr>
-        <w:spacing w:after="40"/>
-      </w:pPr>
-      <w:r>
-        <w:rPr>
-          <w:rFonts w:ascii="Calibri" w:cs="Calibri" w:eastAsia="Calibri" w:hAnsi="Calibri"/>
-          <w:sz w:val="20"/>
-          <w:szCs w:val="20"/>
-        </w:rPr>
-        <w:t xml:space="preserve">Coordinated tasks and sprint tracking in Jira, tested software, reported defects, and maintained project documentation.</w:t>
+        <w:spacing w:after="30"/>
+      </w:pPr>
+      <w:r>
+        <w:rPr>
+          <w:rFonts w:ascii="Calibri" w:cs="Calibri" w:eastAsia="Calibri" w:hAnsi="Calibri"/>
+          <w:sz w:val="20"/>
+          <w:szCs w:val="20"/>
+        </w:rPr>
+        <w:t xml:space="preserve">Collect web data with Playwright, then clean and organize it with Pandas to build lead lists.</w:t>
       </w:r>
     </w:p>
     <w:p>
@@ -566,26 +699,26 @@
         <w:tabs>
           <w:tab w:val="right" w:pos="10206"/>
         </w:tabs>
-        <w:spacing w:after="30" w:before="100"/>
-      </w:pPr>
-      <w:r>
-        <w:rPr>
-          <w:rFonts w:ascii="Calibri" w:cs="Calibri" w:eastAsia="Calibri" w:hAnsi="Calibri"/>
-          <w:b/>
-          <w:bCs/>
-          <w:sz w:val="20"/>
-          <w:szCs w:val="20"/>
-        </w:rPr>
-        <w:t xml:space="preserve">Data Science and Machine Learning Intern</w:t>
-      </w:r>
-      <w:r>
-        <w:rPr>
-          <w:rFonts w:ascii="Calibri" w:cs="Calibri" w:eastAsia="Calibri" w:hAnsi="Calibri"/>
-          <w:color w:val="404040"/>
-          <w:sz w:val="20"/>
-          <w:szCs w:val="20"/>
-        </w:rPr>
-        <w:t xml:space="preserve">  |  Nexus AI Digital</w:t>
+        <w:spacing w:after="20" w:before="70"/>
+      </w:pPr>
+      <w:r>
+        <w:rPr>
+          <w:rFonts w:ascii="Calibri" w:cs="Calibri" w:eastAsia="Calibri" w:hAnsi="Calibri"/>
+          <w:b/>
+          <w:bCs/>
+          <w:sz w:val="20"/>
+          <w:szCs w:val="20"/>
+        </w:rPr>
+        <w:t xml:space="preserve">Project Management Intern</w:t>
+      </w:r>
+      <w:r>
+        <w:rPr>
+          <w:rFonts w:ascii="Calibri" w:cs="Calibri" w:eastAsia="Calibri" w:hAnsi="Calibri"/>
+          <w:color w:val="404040"/>
+          <w:sz w:val="20"/>
+          <w:szCs w:val="20"/>
+        </w:rPr>
+        <w:t xml:space="preserve">  |  Paklogics</w:t>
       </w:r>
       <w:r>
         <w:rPr>
@@ -596,7 +729,7 @@
           <w:sz w:val="20"/>
           <w:szCs w:val="20"/>
         </w:rPr>
-        <w:t xml:space="preserve">	Sep 12 to Oct 12, 2025</w:t>
+        <w:t xml:space="preserve">	Jan 2026 to Apr 2026</w:t>
       </w:r>
     </w:p>
     <w:p>
@@ -606,15 +739,15 @@
           <w:ilvl w:val="0"/>
           <w:numId w:val="2"/>
         </w:numPr>
-        <w:spacing w:after="40"/>
-      </w:pPr>
-      <w:r>
-        <w:rPr>
-          <w:rFonts w:ascii="Calibri" w:cs="Calibri" w:eastAsia="Calibri" w:hAnsi="Calibri"/>
-          <w:sz w:val="20"/>
-          <w:szCs w:val="20"/>
-        </w:rPr>
-        <w:t xml:space="preserve">Collected and cleaned data, performed exploratory and statistical analysis, and developed and evaluated regression and classification models with Python, Pandas, and scikit-learn.</w:t>
+        <w:spacing w:after="30"/>
+      </w:pPr>
+      <w:r>
+        <w:rPr>
+          <w:rFonts w:ascii="Calibri" w:cs="Calibri" w:eastAsia="Calibri" w:hAnsi="Calibri"/>
+          <w:sz w:val="20"/>
+          <w:szCs w:val="20"/>
+        </w:rPr>
+        <w:t xml:space="preserve">Coordinated tasks and sprint tracking in Jira, tested software, reported defects, and maintained project documentation.</w:t>
       </w:r>
     </w:p>
     <w:p>
@@ -623,26 +756,26 @@
         <w:tabs>
           <w:tab w:val="right" w:pos="10206"/>
         </w:tabs>
-        <w:spacing w:after="30" w:before="100"/>
-      </w:pPr>
-      <w:r>
-        <w:rPr>
-          <w:rFonts w:ascii="Calibri" w:cs="Calibri" w:eastAsia="Calibri" w:hAnsi="Calibri"/>
-          <w:b/>
-          <w:bCs/>
-          <w:sz w:val="20"/>
-          <w:szCs w:val="20"/>
-        </w:rPr>
-        <w:t xml:space="preserve">Python Developer Intern</w:t>
-      </w:r>
-      <w:r>
-        <w:rPr>
-          <w:rFonts w:ascii="Calibri" w:cs="Calibri" w:eastAsia="Calibri" w:hAnsi="Calibri"/>
-          <w:color w:val="404040"/>
-          <w:sz w:val="20"/>
-          <w:szCs w:val="20"/>
-        </w:rPr>
-        <w:t xml:space="preserve">  |  Deepoxy Logics</w:t>
+        <w:spacing w:after="20" w:before="70"/>
+      </w:pPr>
+      <w:r>
+        <w:rPr>
+          <w:rFonts w:ascii="Calibri" w:cs="Calibri" w:eastAsia="Calibri" w:hAnsi="Calibri"/>
+          <w:b/>
+          <w:bCs/>
+          <w:sz w:val="20"/>
+          <w:szCs w:val="20"/>
+        </w:rPr>
+        <w:t xml:space="preserve">Data Science Intern</w:t>
+      </w:r>
+      <w:r>
+        <w:rPr>
+          <w:rFonts w:ascii="Calibri" w:cs="Calibri" w:eastAsia="Calibri" w:hAnsi="Calibri"/>
+          <w:color w:val="404040"/>
+          <w:sz w:val="20"/>
+          <w:szCs w:val="20"/>
+        </w:rPr>
+        <w:t xml:space="preserve">  |  Nexus AI Digital (Remote)</w:t>
       </w:r>
       <w:r>
         <w:rPr>
@@ -653,7 +786,7 @@
           <w:sz w:val="20"/>
           <w:szCs w:val="20"/>
         </w:rPr>
-        <w:t xml:space="preserve">	Jun 2025 to Sep 2025</w:t>
+        <w:t xml:space="preserve">	Sep 2025 to Oct 2025</w:t>
       </w:r>
     </w:p>
     <w:p>
@@ -663,15 +796,15 @@
           <w:ilvl w:val="0"/>
           <w:numId w:val="2"/>
         </w:numPr>
-        <w:spacing w:after="40"/>
-      </w:pPr>
-      <w:r>
-        <w:rPr>
-          <w:rFonts w:ascii="Calibri" w:cs="Calibri" w:eastAsia="Calibri" w:hAnsi="Calibri"/>
-          <w:sz w:val="20"/>
-          <w:szCs w:val="20"/>
-        </w:rPr>
-        <w:t xml:space="preserve">Contributed to Python backend development, REST API testing, debugging, and feature validation.</w:t>
+        <w:spacing w:after="30"/>
+      </w:pPr>
+      <w:r>
+        <w:rPr>
+          <w:rFonts w:ascii="Calibri" w:cs="Calibri" w:eastAsia="Calibri" w:hAnsi="Calibri"/>
+          <w:sz w:val="20"/>
+          <w:szCs w:val="20"/>
+        </w:rPr>
+        <w:t xml:space="preserve">Cleaned and analyzed data, and built regression and classification models with Pandas and scikit-learn.</w:t>
       </w:r>
     </w:p>
     <w:p>
@@ -680,26 +813,26 @@
         <w:tabs>
           <w:tab w:val="right" w:pos="10206"/>
         </w:tabs>
-        <w:spacing w:after="30" w:before="100"/>
-      </w:pPr>
-      <w:r>
-        <w:rPr>
-          <w:rFonts w:ascii="Calibri" w:cs="Calibri" w:eastAsia="Calibri" w:hAnsi="Calibri"/>
-          <w:b/>
-          <w:bCs/>
-          <w:sz w:val="20"/>
-          <w:szCs w:val="20"/>
-        </w:rPr>
-        <w:t xml:space="preserve">Telesales Representative</w:t>
-      </w:r>
-      <w:r>
-        <w:rPr>
-          <w:rFonts w:ascii="Calibri" w:cs="Calibri" w:eastAsia="Calibri" w:hAnsi="Calibri"/>
-          <w:color w:val="404040"/>
-          <w:sz w:val="20"/>
-          <w:szCs w:val="20"/>
-        </w:rPr>
-        <w:t xml:space="preserve">  |  Ace Services and iB12</w:t>
+        <w:spacing w:after="20" w:before="70"/>
+      </w:pPr>
+      <w:r>
+        <w:rPr>
+          <w:rFonts w:ascii="Calibri" w:cs="Calibri" w:eastAsia="Calibri" w:hAnsi="Calibri"/>
+          <w:b/>
+          <w:bCs/>
+          <w:sz w:val="20"/>
+          <w:szCs w:val="20"/>
+        </w:rPr>
+        <w:t xml:space="preserve">Python Developer Intern</w:t>
+      </w:r>
+      <w:r>
+        <w:rPr>
+          <w:rFonts w:ascii="Calibri" w:cs="Calibri" w:eastAsia="Calibri" w:hAnsi="Calibri"/>
+          <w:color w:val="404040"/>
+          <w:sz w:val="20"/>
+          <w:szCs w:val="20"/>
+        </w:rPr>
+        <w:t xml:space="preserve">  |  DeepOxy Logics</w:t>
       </w:r>
       <w:r>
         <w:rPr>
@@ -710,7 +843,7 @@
           <w:sz w:val="20"/>
           <w:szCs w:val="20"/>
         </w:rPr>
-        <w:t xml:space="preserve">	Mar 2024 to Aug 2025</w:t>
+        <w:t xml:space="preserve">	Jun 2025 to Sep 2025</w:t>
       </w:r>
     </w:p>
     <w:p>
@@ -720,36 +853,15 @@
           <w:ilvl w:val="0"/>
           <w:numId w:val="2"/>
         </w:numPr>
-        <w:spacing w:after="40"/>
-      </w:pPr>
-      <w:r>
-        <w:rPr>
-          <w:rFonts w:ascii="Calibri" w:cs="Calibri" w:eastAsia="Calibri" w:hAnsi="Calibri"/>
-          <w:sz w:val="20"/>
-          <w:szCs w:val="20"/>
-        </w:rPr>
-        <w:t xml:space="preserve">Managed high-volume customer conversations and strengthened client communication and problem-solving skills.</w:t>
-      </w:r>
-    </w:p>
-    <w:p>
-      <w:pPr>
-        <w:keepNext/>
-        <w:pBdr>
-          <w:bottom w:val="single" w:color="000000" w:sz="6" w:space="2"/>
-        </w:pBdr>
-        <w:spacing w:after="80" w:before="200"/>
-      </w:pPr>
-      <w:r>
-        <w:rPr>
-          <w:rFonts w:ascii="Calibri" w:cs="Calibri" w:eastAsia="Calibri" w:hAnsi="Calibri"/>
-          <w:b/>
-          <w:bCs/>
-          <w:color w:val="000000"/>
-          <w:spacing w:val="20"/>
-          <w:sz w:val="22"/>
-          <w:szCs w:val="22"/>
-        </w:rPr>
-        <w:t xml:space="preserve">EDUCATION</w:t>
+        <w:spacing w:after="30"/>
+      </w:pPr>
+      <w:r>
+        <w:rPr>
+          <w:rFonts w:ascii="Calibri" w:cs="Calibri" w:eastAsia="Calibri" w:hAnsi="Calibri"/>
+          <w:sz w:val="20"/>
+          <w:szCs w:val="20"/>
+        </w:rPr>
+        <w:t xml:space="preserve">Python and Flask projects covering backend development, REST API testing, debugging and validation.</w:t>
       </w:r>
     </w:p>
     <w:p>
@@ -758,26 +870,26 @@
         <w:tabs>
           <w:tab w:val="right" w:pos="10206"/>
         </w:tabs>
-        <w:spacing w:after="30" w:before="60"/>
-      </w:pPr>
-      <w:r>
-        <w:rPr>
-          <w:rFonts w:ascii="Calibri" w:cs="Calibri" w:eastAsia="Calibri" w:hAnsi="Calibri"/>
-          <w:b/>
-          <w:bCs/>
-          <w:sz w:val="20"/>
-          <w:szCs w:val="20"/>
-        </w:rPr>
-        <w:t xml:space="preserve">Bachelor of Science in Computer Science</w:t>
-      </w:r>
-      <w:r>
-        <w:rPr>
-          <w:rFonts w:ascii="Calibri" w:cs="Calibri" w:eastAsia="Calibri" w:hAnsi="Calibri"/>
-          <w:color w:val="404040"/>
-          <w:sz w:val="20"/>
-          <w:szCs w:val="20"/>
-        </w:rPr>
-        <w:t xml:space="preserve">  |  University of Agriculture Faisalabad</w:t>
+        <w:spacing w:after="20" w:before="70"/>
+      </w:pPr>
+      <w:r>
+        <w:rPr>
+          <w:rFonts w:ascii="Calibri" w:cs="Calibri" w:eastAsia="Calibri" w:hAnsi="Calibri"/>
+          <w:b/>
+          <w:bCs/>
+          <w:sz w:val="20"/>
+          <w:szCs w:val="20"/>
+        </w:rPr>
+        <w:t xml:space="preserve">Telesales Representative</w:t>
+      </w:r>
+      <w:r>
+        <w:rPr>
+          <w:rFonts w:ascii="Calibri" w:cs="Calibri" w:eastAsia="Calibri" w:hAnsi="Calibri"/>
+          <w:color w:val="404040"/>
+          <w:sz w:val="20"/>
+          <w:szCs w:val="20"/>
+        </w:rPr>
+        <w:t xml:space="preserve">  |  ACE Services</w:t>
       </w:r>
       <w:r>
         <w:rPr>
@@ -788,66 +900,7 @@
           <w:sz w:val="20"/>
           <w:szCs w:val="20"/>
         </w:rPr>
-        <w:t xml:space="preserve">	2023 to 2027</w:t>
-      </w:r>
-    </w:p>
-    <w:p>
-      <w:pPr>
-        <w:tabs>
-          <w:tab w:val="right" w:pos="10206"/>
-        </w:tabs>
-        <w:spacing w:after="30" w:before="30"/>
-      </w:pPr>
-      <w:r>
-        <w:rPr>
-          <w:rFonts w:ascii="Calibri" w:cs="Calibri" w:eastAsia="Calibri" w:hAnsi="Calibri"/>
-          <w:b/>
-          <w:bCs/>
-          <w:sz w:val="20"/>
-          <w:szCs w:val="20"/>
-        </w:rPr>
-        <w:t xml:space="preserve">Intermediate in Computer Science</w:t>
-      </w:r>
-      <w:r>
-        <w:rPr>
-          <w:rFonts w:ascii="Calibri" w:cs="Calibri" w:eastAsia="Calibri" w:hAnsi="Calibri"/>
-          <w:color w:val="404040"/>
-          <w:sz w:val="20"/>
-          <w:szCs w:val="20"/>
-        </w:rPr>
-        <w:t xml:space="preserve">  |  Army Public School and College System</w:t>
-      </w:r>
-      <w:r>
-        <w:rPr>
-          <w:rFonts w:ascii="Calibri" w:cs="Calibri" w:eastAsia="Calibri" w:hAnsi="Calibri"/>
-          <w:i/>
-          <w:iCs/>
-          <w:color w:val="404040"/>
-          <w:sz w:val="20"/>
-          <w:szCs w:val="20"/>
-        </w:rPr>
-        <w:t xml:space="preserve">	2021 to 2023</w:t>
-      </w:r>
-    </w:p>
-    <w:p>
-      <w:pPr>
-        <w:keepNext/>
-        <w:pBdr>
-          <w:bottom w:val="single" w:color="000000" w:sz="6" w:space="2"/>
-        </w:pBdr>
-        <w:spacing w:after="80" w:before="200"/>
-      </w:pPr>
-      <w:r>
-        <w:rPr>
-          <w:rFonts w:ascii="Calibri" w:cs="Calibri" w:eastAsia="Calibri" w:hAnsi="Calibri"/>
-          <w:b/>
-          <w:bCs/>
-          <w:color w:val="000000"/>
-          <w:spacing w:val="20"/>
-          <w:sz w:val="22"/>
-          <w:szCs w:val="22"/>
-        </w:rPr>
-        <w:t xml:space="preserve">CERTIFICATIONS</w:t>
+        <w:t xml:space="preserve">	Jan 2025 to Aug 2025</w:t>
       </w:r>
     </w:p>
     <w:p>
@@ -857,15 +910,134 @@
           <w:ilvl w:val="0"/>
           <w:numId w:val="2"/>
         </w:numPr>
-        <w:spacing w:after="40"/>
-      </w:pPr>
-      <w:r>
-        <w:rPr>
-          <w:rFonts w:ascii="Calibri" w:cs="Calibri" w:eastAsia="Calibri" w:hAnsi="Calibri"/>
-          <w:sz w:val="20"/>
-          <w:szCs w:val="20"/>
-        </w:rPr>
-        <w:t xml:space="preserve">IBM RAG and Agentic AI Professional Certificate (in progress)</w:t>
+        <w:spacing w:after="30"/>
+      </w:pPr>
+      <w:r>
+        <w:rPr>
+          <w:rFonts w:ascii="Calibri" w:cs="Calibri" w:eastAsia="Calibri" w:hAnsi="Calibri"/>
+          <w:sz w:val="20"/>
+          <w:szCs w:val="20"/>
+        </w:rPr>
+        <w:t xml:space="preserve">Handled business development and outsourcing tasks for an architecture services firm.</w:t>
+      </w:r>
+    </w:p>
+    <w:p>
+      <w:pPr>
+        <w:keepNext/>
+        <w:pBdr>
+          <w:bottom w:val="single" w:color="000000" w:sz="6" w:space="2"/>
+        </w:pBdr>
+        <w:spacing w:after="70" w:before="150"/>
+      </w:pPr>
+      <w:r>
+        <w:rPr>
+          <w:rFonts w:ascii="Calibri" w:cs="Calibri" w:eastAsia="Calibri" w:hAnsi="Calibri"/>
+          <w:b/>
+          <w:bCs/>
+          <w:color w:val="000000"/>
+          <w:spacing w:val="20"/>
+          <w:sz w:val="22"/>
+          <w:szCs w:val="22"/>
+        </w:rPr>
+        <w:t xml:space="preserve">EDUCATION</w:t>
+      </w:r>
+    </w:p>
+    <w:p>
+      <w:pPr>
+        <w:keepNext/>
+        <w:tabs>
+          <w:tab w:val="right" w:pos="10206"/>
+        </w:tabs>
+        <w:spacing w:after="20" w:before="40"/>
+      </w:pPr>
+      <w:r>
+        <w:rPr>
+          <w:rFonts w:ascii="Calibri" w:cs="Calibri" w:eastAsia="Calibri" w:hAnsi="Calibri"/>
+          <w:b/>
+          <w:bCs/>
+          <w:sz w:val="20"/>
+          <w:szCs w:val="20"/>
+        </w:rPr>
+        <w:t xml:space="preserve">Bachelor of Science in Computer Science</w:t>
+      </w:r>
+      <w:r>
+        <w:rPr>
+          <w:rFonts w:ascii="Calibri" w:cs="Calibri" w:eastAsia="Calibri" w:hAnsi="Calibri"/>
+          <w:color w:val="404040"/>
+          <w:sz w:val="20"/>
+          <w:szCs w:val="20"/>
+        </w:rPr>
+        <w:t xml:space="preserve">  |  University of Agriculture Faisalabad</w:t>
+      </w:r>
+      <w:r>
+        <w:rPr>
+          <w:rFonts w:ascii="Calibri" w:cs="Calibri" w:eastAsia="Calibri" w:hAnsi="Calibri"/>
+          <w:i/>
+          <w:iCs/>
+          <w:color w:val="404040"/>
+          <w:sz w:val="20"/>
+          <w:szCs w:val="20"/>
+        </w:rPr>
+        <w:t xml:space="preserve">	2023 to 2027</w:t>
+      </w:r>
+    </w:p>
+    <w:p>
+      <w:pPr>
+        <w:tabs>
+          <w:tab w:val="right" w:pos="10206"/>
+        </w:tabs>
+        <w:spacing w:after="20" w:before="40"/>
+      </w:pPr>
+      <w:r>
+        <w:rPr>
+          <w:rFonts w:ascii="Calibri" w:cs="Calibri" w:eastAsia="Calibri" w:hAnsi="Calibri"/>
+          <w:b/>
+          <w:bCs/>
+          <w:sz w:val="20"/>
+          <w:szCs w:val="20"/>
+        </w:rPr>
+        <w:t xml:space="preserve">Intermediate in Computer Science</w:t>
+      </w:r>
+      <w:r>
+        <w:rPr>
+          <w:rFonts w:ascii="Calibri" w:cs="Calibri" w:eastAsia="Calibri" w:hAnsi="Calibri"/>
+          <w:color w:val="404040"/>
+          <w:sz w:val="20"/>
+          <w:szCs w:val="20"/>
+        </w:rPr>
+        <w:t xml:space="preserve">  |  Army Public School and College System</w:t>
+      </w:r>
+      <w:r>
+        <w:rPr>
+          <w:rFonts w:ascii="Calibri" w:cs="Calibri" w:eastAsia="Calibri" w:hAnsi="Calibri"/>
+          <w:i/>
+          <w:iCs/>
+          <w:color w:val="404040"/>
+          <w:sz w:val="20"/>
+          <w:szCs w:val="20"/>
+        </w:rPr>
+        <w:t xml:space="preserve">	2021 to 2023</w:t>
+      </w:r>
+    </w:p>
+    <w:p>
+      <w:pPr>
+        <w:keepNext/>
+        <w:pBdr>
+          <w:bottom w:val="single" w:color="000000" w:sz="6" w:space="2"/>
+        </w:pBdr>
+        <w:spacing w:after="70" w:before="150"/>
+      </w:pPr>
+      <w:r>
+        <w:rPr>
+          <w:rFonts w:ascii="Calibri" w:cs="Calibri" w:eastAsia="Calibri" w:hAnsi="Calibri"/>
+          <w:b/>
+          <w:bCs/>
+          <w:color w:val="000000"/>
+          <w:spacing w:val="20"/>
+          <w:sz w:val="22"/>
+          <w:szCs w:val="22"/>
+        </w:rPr>
+        <w:t xml:space="preserve">CERTIFICATIONS</w:t>
       </w:r>
     </w:p>
     <w:p>
@@ -875,15 +1047,15 @@
           <w:ilvl w:val="0"/>
           <w:numId w:val="2"/>
         </w:numPr>
-        <w:spacing w:after="40"/>
-      </w:pPr>
-      <w:r>
-        <w:rPr>
-          <w:rFonts w:ascii="Calibri" w:cs="Calibri" w:eastAsia="Calibri" w:hAnsi="Calibri"/>
-          <w:sz w:val="20"/>
-          <w:szCs w:val="20"/>
-        </w:rPr>
-        <w:t xml:space="preserve">CI/CD Pipeline with Docker, 2026</w:t>
+        <w:spacing w:after="30"/>
+      </w:pPr>
+      <w:r>
+        <w:rPr>
+          <w:rFonts w:ascii="Calibri" w:cs="Calibri" w:eastAsia="Calibri" w:hAnsi="Calibri"/>
+          <w:sz w:val="20"/>
+          <w:szCs w:val="20"/>
+        </w:rPr>
+        <w:t xml:space="preserve">IBM (Coursera): Build Multimodal Generative AI Applications; Advanced RAG with Vector Databases and Retrievers; Vector Databases for RAG: An Introduction; Build RAG Applications: Get Started</w:t>
       </w:r>
     </w:p>
     <w:p>
@@ -893,15 +1065,15 @@
           <w:ilvl w:val="0"/>
           <w:numId w:val="2"/>
         </w:numPr>
-        <w:spacing w:after="40"/>
-      </w:pPr>
-      <w:r>
-        <w:rPr>
-          <w:rFonts w:ascii="Calibri" w:cs="Calibri" w:eastAsia="Calibri" w:hAnsi="Calibri"/>
-          <w:sz w:val="20"/>
-          <w:szCs w:val="20"/>
-        </w:rPr>
-        <w:t xml:space="preserve">Google AI Fundamentals, 2026</w:t>
+        <w:spacing w:after="30"/>
+      </w:pPr>
+      <w:r>
+        <w:rPr>
+          <w:rFonts w:ascii="Calibri" w:cs="Calibri" w:eastAsia="Calibri" w:hAnsi="Calibri"/>
+          <w:sz w:val="20"/>
+          <w:szCs w:val="20"/>
+        </w:rPr>
+        <w:t xml:space="preserve">IBM RAG and Agentic AI Professional Certificate (in progress)</w:t>
       </w:r>
     </w:p>
     <w:p>
@@ -911,15 +1083,15 @@
           <w:ilvl w:val="0"/>
           <w:numId w:val="2"/>
         </w:numPr>
-        <w:spacing w:after="40"/>
-      </w:pPr>
-      <w:r>
-        <w:rPr>
-          <w:rFonts w:ascii="Calibri" w:cs="Calibri" w:eastAsia="Calibri" w:hAnsi="Calibri"/>
-          <w:sz w:val="20"/>
-          <w:szCs w:val="20"/>
-        </w:rPr>
-        <w:t xml:space="preserve">Google Crash Course on Python, 2025</w:t>
+        <w:spacing w:after="30"/>
+      </w:pPr>
+      <w:r>
+        <w:rPr>
+          <w:rFonts w:ascii="Calibri" w:cs="Calibri" w:eastAsia="Calibri" w:hAnsi="Calibri"/>
+          <w:sz w:val="20"/>
+          <w:szCs w:val="20"/>
+        </w:rPr>
+        <w:t xml:space="preserve">CI/CD Pipeline with Docker, 2026</w:t>
       </w:r>
     </w:p>
     <w:p>
@@ -929,15 +1101,15 @@
           <w:ilvl w:val="0"/>
           <w:numId w:val="2"/>
         </w:numPr>
-        <w:spacing w:after="40"/>
-      </w:pPr>
-      <w:r>
-        <w:rPr>
-          <w:rFonts w:ascii="Calibri" w:cs="Calibri" w:eastAsia="Calibri" w:hAnsi="Calibri"/>
-          <w:sz w:val="20"/>
-          <w:szCs w:val="20"/>
-        </w:rPr>
-        <w:t xml:space="preserve">Google AI Essentials and Prompting, 2025</w:t>
+        <w:spacing w:after="30"/>
+      </w:pPr>
+      <w:r>
+        <w:rPr>
+          <w:rFonts w:ascii="Calibri" w:cs="Calibri" w:eastAsia="Calibri" w:hAnsi="Calibri"/>
+          <w:sz w:val="20"/>
+          <w:szCs w:val="20"/>
+        </w:rPr>
+        <w:t xml:space="preserve">Google: AI Fundamentals, 2026; Crash Course on Python, 2025; AI Essentials and Prompting, 2025</w:t>
       </w:r>
     </w:p>
     <w:sectPr>

</xml_diff>